<commit_message>
Prepare kodama-cpp release candidate
Port the current fastEmbedR UMAP and openTSNE kernels, add the float32 PCA API across C++, CUDA, Metal, R, and Python, and update release validation, provenance, tests, and JMLR manuscript artifacts.
</commit_message>
<xml_diff>
--- a/manuscript/kodama_cpp_jmlr_self_review.docx
+++ b/manuscript/kodama_cpp_jmlr_self_review.docx
@@ -77,7 +77,7 @@
         <w:rPr>
           <w:rFonts w:ascii="Calibri" w:hAnsi="Calibri"/>
         </w:rPr>
-        <w:t>Extend the benchmark table with the larger wrapper-level comparison against the R implementation.</w:t>
+        <w:t>Legacy KNN comparison: a matched MetRef benchmark reports the KNN-capable KODAMA 2.4.1 release and current single-core CPU, four-core CPU, and CUDA paths. It is explicitly labeled as a legacy KNN-to-KNN comparison, not as the current CRAN baseline. A separate comparison with current CRAN KODAMA 3.3 remains necessary and must disclose that its automatic PLS-DA path is not classifier-parity with latent-space PLS-LDA.</w:t>
       </w:r>
     </w:p>
     <w:p>
@@ -93,7 +93,7 @@
         <w:rPr>
           <w:rFonts w:ascii="Calibri" w:hAnsi="Calibri"/>
         </w:rPr>
-        <w:t>Freeze the public API and cite a versioned release, commit hash, and archival DOI.</w:t>
+        <w:t>Continuous integration and coverage: the manually executed CPU, CUDA, Metal, R, and Python checks are substantial, but the repository does not yet contain a cross-platform CI workflow or a measured source-coverage report. Both remain release work under the JMLR MLOSS review criteria.</w:t>
       </w:r>
     </w:p>
     <w:p>
@@ -109,7 +109,7 @@
         <w:rPr>
           <w:rFonts w:ascii="Calibri" w:hAnsi="Calibri"/>
         </w:rPr>
-        <w:t>Freeze the completed license and provenance audit in the versioned release artifacts.</w:t>
+        <w:t>User documentation: installation and wrapper references are present, but the standalone C++ and Python interfaces still need one compact end-to-end tutorial and a browsable generated API site.</w:t>
       </w:r>
     </w:p>
     <w:p>
@@ -125,7 +125,7 @@
         <w:rPr>
           <w:rFonts w:ascii="Calibri" w:hAnsi="Calibri"/>
         </w:rPr>
-        <w:t>Convert the final source into the official JMLR LaTeX style and keep the MLOSS page budget in mind.</w:t>
+        <w:t>Public API and release identity: version 0.1.0, semantic-versioning policy, wrapper versions, and a compile-link API snapshot test are complete. The final tag, commit, source archive, and DOI remain external release actions and are not fabricated.</w:t>
       </w:r>
     </w:p>
     <w:p>
@@ -141,7 +141,39 @@
         <w:rPr>
           <w:rFonts w:ascii="Calibri" w:hAnsi="Calibri"/>
         </w:rPr>
-        <w:t>Run the final ablation matrix across the selected release datasets before making broad claims about visualization improvement.</w:t>
+        <w:t>Licensing and provenance: pinned origins, SPDX identifiers, retained license texts, checksums, and the Metal Apache-2.0 exception are frozen in release documents. The residual coauthor-contribution confirmation is stated explicitly.</w:t>
+      </w:r>
+    </w:p>
+    <w:p>
+      <w:pPr>
+        <w:pStyle w:val="ListNumber"/>
+        <w:numPr>
+          <w:ilvl w:val="0"/>
+          <w:numId w:val="10"/>
+        </w:numPr>
+        <w:spacing w:after="80"/>
+      </w:pPr>
+      <w:r>
+        <w:rPr>
+          <w:rFonts w:ascii="Calibri" w:hAnsi="Calibri"/>
+        </w:rPr>
+        <w:t>MLOSS format: the official-style main paper now occupies four description pages plus references; the detailed manuscript is retained as a technical supplement.</w:t>
+      </w:r>
+    </w:p>
+    <w:p>
+      <w:pPr>
+        <w:pStyle w:val="ListNumber"/>
+        <w:numPr>
+          <w:ilvl w:val="0"/>
+          <w:numId w:val="10"/>
+        </w:numPr>
+        <w:spacing w:after="80"/>
+      </w:pPr>
+      <w:r>
+        <w:rPr>
+          <w:rFonts w:ascii="Calibri" w:hAnsi="Calibri"/>
+        </w:rPr>
+        <w:t>Visualization evidence: a fixed CUDA M=100/Tcycle=100 panel now reports both classifiers, both embeddings, runtime, ARI, active classes, silhouette, and local purity on five named nonspatial datasets. Its positive and negative outcomes, including the 44,808-sample scale case, are retained. Matched backend and historical-wrapper matrices remain required before broad empirical claims.</w:t>
       </w:r>
     </w:p>
     <w:p>
@@ -245,6 +277,18 @@
         <w:rPr>
           <w:rFonts w:ascii="Calibri" w:hAnsi="Calibri"/>
         </w:rPr>
+        <w:t>Completed a pinned licensing and provenance audit with per-file SPDX identifiers, retained third-party notices and license checksums, explicit KODAMA/fastPLS relicensing scope, and the MIT/Apache-2.0 Metal exception.</w:t>
+      </w:r>
+    </w:p>
+    <w:p>
+      <w:pPr>
+        <w:pStyle w:val="ListBullet"/>
+        <w:spacing w:after="80"/>
+      </w:pPr>
+      <w:r>
+        <w:rPr>
+          <w:rFonts w:ascii="Calibri" w:hAnsi="Calibri"/>
+        </w:rPr>
         <w:t>Added a public-literature comparison against the original KODAMA paper, the Bioinformatics R-package paper, and the documented R interface.</w:t>
       </w:r>
     </w:p>
@@ -270,6 +314,18 @@
           <w:rFonts w:ascii="Calibri" w:hAnsi="Calibri"/>
         </w:rPr>
         <w:t>Added a compact architecture figure showing R/Python wrappers, the C++17 core, CPU, CUDA, and Metal backends, graph/embedding/clustering utilities, and typed outputs.</w:t>
+      </w:r>
+    </w:p>
+    <w:p>
+      <w:pPr>
+        <w:pStyle w:val="ListBullet"/>
+        <w:spacing w:after="80"/>
+      </w:pPr>
+      <w:r>
+        <w:rPr>
+          <w:rFonts w:ascii="Calibri" w:hAnsi="Calibri"/>
+        </w:rPr>
+        <w:t>Reframed the implementation contribution around backend-native state ownership and added separate CUDA and Apple Metal subsections with explicit host/device boundaries, reusable workspaces, strict backend identity, and a shared parity contract.</w:t>
       </w:r>
     </w:p>
     <w:p>
@@ -365,6 +421,54 @@
         <w:rPr>
           <w:rFonts w:ascii="Calibri" w:hAnsi="Calibri"/>
         </w:rPr>
+        <w:t>Added a frozen 0.1.0 public API contract, version header, compile-link API test, changelog, contribution guide, prior-version delta, release checklist, and clean-tag archive script.</w:t>
+      </w:r>
+    </w:p>
+    <w:p>
+      <w:pPr>
+        <w:pStyle w:val="ListBullet"/>
+        <w:spacing w:after="80"/>
+      </w:pPr>
+      <w:r>
+        <w:rPr>
+          <w:rFonts w:ascii="Calibri" w:hAnsi="Calibri"/>
+        </w:rPr>
+        <w:t>Separated the submission into an official four-page MLOSS paper plus references and a detailed technical supplement.</w:t>
+      </w:r>
+    </w:p>
+    <w:p>
+      <w:pPr>
+        <w:pStyle w:val="ListBullet"/>
+        <w:spacing w:after="80"/>
+      </w:pPr>
+      <w:r>
+        <w:rPr>
+          <w:rFonts w:ascii="Calibri" w:hAnsi="Calibri"/>
+        </w:rPr>
+        <w:t>Added a track-specific cover-letter draft and a reviewer-comment response matrix with all author-only and external release fields left explicit.</w:t>
+      </w:r>
+    </w:p>
+    <w:p>
+      <w:pPr>
+        <w:pStyle w:val="ListBullet"/>
+        <w:spacing w:after="80"/>
+      </w:pPr>
+      <w:r>
+        <w:rPr>
+          <w:rFonts w:ascii="Calibri" w:hAnsi="Calibri"/>
+        </w:rPr>
+        <w:t>Added resumable release-validation, nonspatial M/Tcycle sensitivity, historical-R, backend, and six-panel UMAP/openTSNE benchmark drivers.</w:t>
+      </w:r>
+    </w:p>
+    <w:p>
+      <w:pPr>
+        <w:pStyle w:val="ListBullet"/>
+        <w:spacing w:after="80"/>
+      </w:pPr>
+      <w:r>
+        <w:rPr>
+          <w:rFonts w:ascii="Calibri" w:hAnsi="Calibri"/>
+        </w:rPr>
         <w:t>Inserted completed current-validation results from the CUDA workstation: CV kernel speedups, CoreKNN/CorePLSLDA optimization medians, and the MetRef KODAMA.matrix validation benchmark.</w:t>
       </w:r>
     </w:p>
@@ -377,7 +481,67 @@
         <w:rPr>
           <w:rFonts w:ascii="Calibri" w:hAnsi="Calibri"/>
         </w:rPr>
-        <w:t>Added a reproducible M/Tcycle sensitivity experiment on two representative benchmarks for KNN and PLS-LDA, including quantitative tables and a curve figure.</w:t>
+        <w:t>Completed the named MetRef/USPS M/Tcycle sensitivity experiment on CUDA and inserted the numerical tables and curve figure.</w:t>
+      </w:r>
+    </w:p>
+    <w:p>
+      <w:pPr>
+        <w:pStyle w:val="ListBullet"/>
+        <w:spacing w:after="80"/>
+      </w:pPr>
+      <w:r>
+        <w:rPr>
+          <w:rFonts w:ascii="Calibri" w:hAnsi="Calibri"/>
+        </w:rPr>
+        <w:t>Added an agreement-graph convergence analysis showing why M controls Monte Carlo precision rather than single-run optimization quality; reported empirical RMSE/correlation and the 1/(2 sqrt(M)) worst-case standard-error bound.</w:t>
+      </w:r>
+    </w:p>
+    <w:p>
+      <w:pPr>
+        <w:pStyle w:val="ListBullet"/>
+        <w:spacing w:after="80"/>
+      </w:pPr>
+      <w:r>
+        <w:rPr>
+          <w:rFonts w:ascii="Calibri" w:hAnsi="Calibri"/>
+        </w:rPr>
+        <w:t>Updated the end-to-end MetRef evidence to M=100/Tcycle=100 and reported the KNN collapse alongside the much stronger PLS-LDA external-label and visualization diagnostics.</w:t>
+      </w:r>
+    </w:p>
+    <w:p>
+      <w:pPr>
+        <w:pStyle w:val="ListBullet"/>
+        <w:spacing w:after="80"/>
+      </w:pPr>
+      <w:r>
+        <w:rPr>
+          <w:rFonts w:ascii="Calibri" w:hAnsi="Calibri"/>
+        </w:rPr>
+        <w:t>Replaced the obsolete short-run visualization preview with a reproducible five-dataset CUDA panel at M=100/Tcycle=100, archived its complete CSV and six-panel plots, and added a balanced silhouette/runtime/ARI figure that retains negative results.</w:t>
+      </w:r>
+    </w:p>
+    <w:p>
+      <w:pPr>
+        <w:pStyle w:val="ListBullet"/>
+        <w:spacing w:after="80"/>
+      </w:pPr>
+      <w:r>
+        <w:rPr>
+          <w:rFonts w:ascii="Calibri" w:hAnsi="Calibri"/>
+        </w:rPr>
+        <w:t>Bounded each independent CUDA k-means assignment workspace at 256 MiB and row-batched exact centroid scoring, allowing the 44,808-sample nonspatial panel to complete with four concurrent M lanes on a 16 GiB GPU.</w:t>
+      </w:r>
+    </w:p>
+    <w:p>
+      <w:pPr>
+        <w:pStyle w:val="ListBullet"/>
+        <w:spacing w:after="80"/>
+      </w:pPr>
+      <w:r>
+        <w:rPr>
+          <w:rFonts w:ascii="Calibri" w:hAnsi="Calibri"/>
+        </w:rPr>
+        <w:t>Completed the matched MetRef legacy KNN comparison: current single-core, four-core, and CUDA wall times are reported against KODAMA R 2.4.1, with explicit disclosure that it is not the current CRAN release and that proposal trajectories differ.</w:t>
       </w:r>
     </w:p>
     <w:p>
@@ -409,7 +573,7 @@
         <w:rPr>
           <w:rFonts w:ascii="Calibri" w:hAnsi="Calibri"/>
         </w:rPr>
-        <w:t>Run the larger wrapper-level comparison against the historical R implementation.</w:t>
+        <w:t>Extend the completed five-dataset visualization panel to additional data domains and run the remaining matched backend and release-ablation matrices on the release hardware.</w:t>
       </w:r>
     </w:p>
     <w:p>
@@ -421,7 +585,7 @@
         <w:rPr>
           <w:rFonts w:ascii="Calibri" w:hAnsi="Calibri"/>
         </w:rPr>
-        <w:t>Prepare the cover letter for the MLOSS track.</w:t>
+        <w:t>Add Linux and macOS continuous-integration jobs for the standalone core and wrappers, retain accelerator validation as a separately documented hardware job, and publish a measured line/branch coverage report.</w:t>
       </w:r>
     </w:p>
     <w:p>
@@ -433,7 +597,49 @@
         <w:rPr>
           <w:rFonts w:ascii="Calibri" w:hAnsi="Calibri"/>
         </w:rPr>
-        <w:t>Archive the reviewed software version.</w:t>
+        <w:t>Publish a compact C++/R/Python end-to-end tutorial and generated API documentation at a stable project URL.</w:t>
+      </w:r>
+    </w:p>
+    <w:p>
+      <w:pPr>
+        <w:pStyle w:val="ListBullet"/>
+        <w:spacing w:after="80"/>
+      </w:pPr>
+      <w:r>
+        <w:rPr>
+          <w:rFonts w:ascii="Calibri" w:hAnsi="Calibri"/>
+        </w:rPr>
+        <w:t>Create and push the clean v0.1.0 tag, archive it, record the SHA-256 digest, and deposit it for an archival DOI.</w:t>
+      </w:r>
+    </w:p>
+    <w:p>
+      <w:pPr>
+        <w:pStyle w:val="ListBullet"/>
+        <w:spacing w:after="80"/>
+      </w:pPr>
+      <w:r>
+        <w:rPr>
+          <w:rFonts w:ascii="Calibri" w:hAnsi="Calibri"/>
+        </w:rPr>
+        <w:t>Obtain coauthor consent; complete funding, competing-interest, action-editor, reviewer, and current user-community fields in the cover letter; and confirm that no adapted KODAMA or fastPLS code was supplied outside the inspected Git history, or retain the relevant permission.</w:t>
+      </w:r>
+    </w:p>
+    <w:p>
+      <w:pPr>
+        <w:pStyle w:val="Heading1"/>
+      </w:pPr>
+      <w:r>
+        <w:t>Reviewer Recommendation</w:t>
+      </w:r>
+    </w:p>
+    <w:p>
+      <w:r>
+        <w:t>Recommendation: promising JMLR MLOSS submission after the listed release-engineering actions. The four-page paper is focused, the KODAMA search is reproducible from the text, the heterogeneous architecture is a non-trivial software contribution, and limitations and negative results are stated with unusual clarity. Additional theory is not the priority.</w:t>
+      </w:r>
+    </w:p>
+    <w:p>
+      <w:r>
+        <w:t>The principal desk-review risks are the absence of committed cross-platform CI and measured coverage, the lack of a stable hosted tutorial/API site, and incomplete tag, DOI, community-metric, and author declarations. Broader benchmarks strengthen impact, but these software-quality items are at least as important under the published MLOSS criteria.</w:t>
       </w:r>
     </w:p>
     <w:sectPr>

</xml_diff>